<commit_message>
Add patriotic appeal and bibliography to both trabalhos
Co-Authored-By: Claude Sonnet 5.5 <noreply@anthropic.com>
Claude-Session: https://claude.ai/code/session_015AGSt81GPbHH6yYpGnQKdU
</commit_message>
<xml_diff>
--- a/Inc 3/A_Corda_de_81_Nos_no_Rito_Brasileiro.docx
+++ b/Inc 3/A_Corda_de_81_Nos_no_Rito_Brasileiro.docx
@@ -146,21 +146,6 @@
           <w:b w:val="0"/>
           <w:sz w:val="24"/>
         </w:rPr>
-        <w:t>Antes de passar ao nó, vale observar que o número oitenta e um não nos é apresentado como um enigma para ser resolvido, mas como um convite à meditação. Os símbolos maçônicos não funcionam como definições de dicionário. Eles funcionam como sementes: dizem pouco ao que passa depressa e muito ao que se detém. Quem se demora diante da corda e conta, em silêncio, os seus nós descobre que o exercício, por si só, ensina paciência, atenção e método, qualidades indispensáveis ao Maçom.</w:t>
-      </w:r>
-    </w:p>
-    <w:p>
-      <w:pPr>
-        <w:spacing w:line="240" w:lineRule="auto" w:before="0" w:after="120"/>
-        <w:ind w:firstLine="709"/>
-        <w:jc w:val="both"/>
-      </w:pPr>
-      <w:r>
-        <w:rPr>
-          <w:rFonts w:ascii="Times New Roman" w:hAnsi="Times New Roman"/>
-          <w:b w:val="0"/>
-          <w:sz w:val="24"/>
-        </w:rPr>
         <w:t>Passemos ao nó. O nó, em qualquer cultura, é o gesto de ligar, de prender, de tornar duas coisas uma. Na corda da Loja, os nós são indissolúveis, entrelaçados de modo a não se desfazerem. Cada nó pode ser lido como um Irmão, e cada trecho de corda entre dois nós, como o vínculo que o prende ao seguinte. Ninguém está só: cada um sustenta e é sustentado. O Livro do Eclesiastes, ao tratar da amizade, afirma que o cordão de três dobras não se rompe facilmente. A Maçonaria, que tantas vezes se serve dessa sabedoria bíblica, ensina que uma corda se fortalece quando suas fibras se entrelaçam.</w:t>
       </w:r>
     </w:p>
@@ -251,6 +236,36 @@
           <w:b w:val="0"/>
           <w:sz w:val="24"/>
         </w:rPr>
+        <w:t>Dirijo-me, neste ponto, de modo especial aos Irmãos que fizeram da farda a sua vocação, mas a mensagem é de todos. A Pátria também é uma corda. Ela se compõe de gerações atadas umas às outras pela língua, pela história, pelo sacrifício e pelo trabalho de cada dia. E a nossa história mostra o entrelaçamento entre essas duas cordas. Em 1822, a Maçonaria esteve presente no processo que levou à Independência: José Bonifácio e Joaquim Gonçalves Ledo, ainda que divergissem quanto aos caminhos, foram figuras centrais do Grande Oriente da época, e o próprio príncipe Dom Pedro foi iniciado em 2 de agosto daquele ano. Na proclamação da República, o marechal Deodoro da Fonseca, segundo diversas fontes, exerceu também o Grão-Mestrado do Grande Oriente do Brasil. Não afirmo, com isso, que a Maçonaria seja dona da história nacional, nem que lhe caiba a política partidária, que lhe é vedada. Afirmo apenas que homens atados por esses nós sempre entenderam que servir à Pátria é consequência natural do compromisso fraterno.</w:t>
+      </w:r>
+    </w:p>
+    <w:p>
+      <w:pPr>
+        <w:spacing w:line="240" w:lineRule="auto" w:before="0" w:after="120"/>
+        <w:ind w:firstLine="709"/>
+        <w:jc w:val="both"/>
+      </w:pPr>
+      <w:r>
+        <w:rPr>
+          <w:rFonts w:ascii="Times New Roman" w:hAnsi="Times New Roman"/>
+          <w:b w:val="0"/>
+          <w:sz w:val="24"/>
+        </w:rPr>
+        <w:t>Aos militares aqui presentes, o símbolo fala uma linguagem que conhecem bem. A cadeia de comando e a Cadeia de União têm em comum o que há de mais precioso na vida de uma corporação: a disciplina, a hierarquia entendida como serviço, a lealdade ao companheiro de farda e a certeza de que ninguém vence sozinho. O soldado que confia no camarada ao seu lado e o Maçom que confia no Irmão à sua mão sabem que a força de uma tropa, como a de uma corda, é a força de seu elo mais frágil e a firmeza de todos. E o Maçom, civil ou militar, aprende no Templo que o amor à Pátria se mede menos pela exaltação das palavras do que pelo trabalho honesto, pelo respeito às leis, pela palavra cumprida e pelo cuidado com o semelhante.</w:t>
+      </w:r>
+    </w:p>
+    <w:p>
+      <w:pPr>
+        <w:spacing w:line="240" w:lineRule="auto" w:before="0" w:after="120"/>
+        <w:ind w:firstLine="709"/>
+        <w:jc w:val="both"/>
+      </w:pPr>
+      <w:r>
+        <w:rPr>
+          <w:rFonts w:ascii="Times New Roman" w:hAnsi="Times New Roman"/>
+          <w:b w:val="0"/>
+          <w:sz w:val="24"/>
+        </w:rPr>
         <w:t>Cabe mencionar, ainda, as borlas que arrematam a corda. Pendentes, em geral nos ângulos do Painel, elas suavizam o traçado rígido da cordoaria e acrescentam uma nota de beleza. Alguns as interpretam como a lembrança de que a corda, embora fechada em círculo, não é fechada à fraternidade: suas extremidades pendem como mãos estendidas aos que ainda virão. É uma leitura que me agrada, ainda que não possa afirmar ser a de todos os rituais. Em todo caso, mostra que o rigor do símbolo não elimina a ternura que ele também encerra.</w:t>
       </w:r>
     </w:p>
@@ -296,7 +311,7 @@
           <w:b w:val="0"/>
           <w:sz w:val="24"/>
         </w:rPr>
-        <w:t>Concluindo, a Corda de 81 Nós no Rito Brasileiro reúne, em um só símbolo, a medida e a retidão herdadas do ofício, a plenitude indicada pela numerologia, a união expressa pelo nó e a fronteira que protege o espaço sagrado. Ela nos recorda que a Maçonaria é uma corrente e que a sua força não reside nos nomes ilustres ou nos títulos, mas na solidez de cada elo. Que cada um de nós, ao entrar no Templo e ver a corda que o envolve, se pergunte: o meu nó está firme? E que a resposta se traduza em atitudes. É o que lhes peço e o que a mim mesmo peço. Tenho dito.</w:t>
+        <w:t>Concluindo, a Corda de 81 Nós no Rito Brasileiro reúne, em um só símbolo, a medida e a retidão herdadas do ofício, a plenitude indicada pela numerologia, a união expressa pelo nó, a fronteira que protege o espaço sagrado e o laço que nos prende à Pátria. Ela nos recorda que a Maçonaria é uma corrente e que a sua força não reside nos nomes ilustres ou nos títulos, mas na solidez de cada elo. Que cada um de nós, ao entrar no Templo e ver a corda que o envolve, se pergunte: o meu nó está firme? E que a resposta se traduza em atitudes. É o que lhes peço e o que a mim mesmo peço. Tenho dito.</w:t>
       </w:r>
     </w:p>
     <w:p>
@@ -338,6 +353,62 @@
           <w:b w:val="0"/>
           <w:sz w:val="24"/>
         </w:rPr>
+        <w:t>BÍBLIA SAGRADA. Eclesiastes, cap. 4, v. 12.</w:t>
+      </w:r>
+    </w:p>
+    <w:p>
+      <w:pPr>
+        <w:spacing w:line="240" w:lineRule="auto" w:before="0" w:after="120"/>
+        <w:jc w:val="left"/>
+      </w:pPr>
+      <w:r>
+        <w:rPr>
+          <w:rFonts w:ascii="Times New Roman" w:hAnsi="Times New Roman"/>
+          <w:b w:val="0"/>
+          <w:sz w:val="24"/>
+        </w:rPr>
+        <w:t>BOUCHER, Jules. A Simbólica Maçônica. São Paulo: Pensamento, 1994.</w:t>
+      </w:r>
+    </w:p>
+    <w:p>
+      <w:pPr>
+        <w:spacing w:line="240" w:lineRule="auto" w:before="0" w:after="120"/>
+        <w:jc w:val="left"/>
+      </w:pPr>
+      <w:r>
+        <w:rPr>
+          <w:rFonts w:ascii="Times New Roman" w:hAnsi="Times New Roman"/>
+          <w:b w:val="0"/>
+          <w:sz w:val="24"/>
+        </w:rPr>
+        <w:t>CAMINO, Rizzardo da. Dicionário Maçônico. São Paulo: Madras, 2020.</w:t>
+      </w:r>
+    </w:p>
+    <w:p>
+      <w:pPr>
+        <w:spacing w:line="240" w:lineRule="auto" w:before="0" w:after="120"/>
+        <w:jc w:val="left"/>
+      </w:pPr>
+      <w:r>
+        <w:rPr>
+          <w:rFonts w:ascii="Times New Roman" w:hAnsi="Times New Roman"/>
+          <w:b w:val="0"/>
+          <w:sz w:val="24"/>
+        </w:rPr>
+        <w:t>CAMINO, Rizzardo da. Simbolismo do Primeiro Grau: Aprendiz. São Paulo: Madras. [completar a edição e o ano].</w:t>
+      </w:r>
+    </w:p>
+    <w:p>
+      <w:pPr>
+        <w:spacing w:line="240" w:lineRule="auto" w:before="0" w:after="120"/>
+        <w:jc w:val="left"/>
+      </w:pPr>
+      <w:r>
+        <w:rPr>
+          <w:rFonts w:ascii="Times New Roman" w:hAnsi="Times New Roman"/>
+          <w:b w:val="0"/>
+          <w:sz w:val="24"/>
+        </w:rPr>
         <w:t>Ritual do Grau de Aprendiz Maçom do Rito Brasileiro. [completar com edição, obediência e ano].</w:t>
       </w:r>
     </w:p>
@@ -352,7 +423,7 @@
           <w:b w:val="0"/>
           <w:sz w:val="24"/>
         </w:rPr>
-        <w:t>BÍBLIA SAGRADA. Eclesiastes, cap. 4, v. 12.</w:t>
+        <w:t>A MAÇONARIA no processo da Independência do Brasil. Folha BV. Disponível em: https://www.folhabv.com.br/?p=114481. Acesso em: 26 out. 2026.</w:t>
       </w:r>
     </w:p>
     <w:p>
@@ -366,7 +437,7 @@
           <w:b w:val="0"/>
           <w:sz w:val="24"/>
         </w:rPr>
-        <w:t>AUDITÓRIO IBIRAPUERA. Quais são os três pilares da maçonaria? Disponível em: https://www.auditorioibirapuera.com.br/quais-sao-os-tres-pilares-da-maconaria/. [conferir a data de acesso].</w:t>
+        <w:t>LA MASONERÍA y la independencia del Brasil. Museo Virtual de Historia de la Masonería, UNED. Disponível em: https://www.uned.es/universidad/inicio/en/unidad/museo-virtual-historia-masoneria/sala-vi-historia-de-la-masoneria-en-otros-paises/la-masoneria-y-la-independencia-del-brasil.html. Acesso em: 26 out. 2026.</w:t>
       </w:r>
     </w:p>
     <w:p>
@@ -380,7 +451,21 @@
           <w:b w:val="0"/>
           <w:sz w:val="24"/>
         </w:rPr>
-        <w:t>[Incluir autores e obras consultados sobre o simbolismo do cordão e dos nós, no padrão pedido pela Comissão de Graus.]</w:t>
+        <w:t>Artigo sobre a Maçonaria e a Proclamação da República. Revista Sankofa, USP. Disponível em: https://periodicos.usp.br/sankofa/article/download/169147/160375/403532. Acesso em: 26 out. 2026. [completar autor e título].</w:t>
+      </w:r>
+    </w:p>
+    <w:p>
+      <w:pPr>
+        <w:spacing w:line="240" w:lineRule="auto" w:before="0" w:after="120"/>
+        <w:jc w:val="left"/>
+      </w:pPr>
+      <w:r>
+        <w:rPr>
+          <w:rFonts w:ascii="Times New Roman" w:hAnsi="Times New Roman"/>
+          <w:b w:val="0"/>
+          <w:sz w:val="24"/>
+        </w:rPr>
+        <w:t>AUDITÓRIO IBIRAPUERA. Quais são os três pilares da maçonaria? Disponível em: https://www.auditorioibirapuera.com.br/quais-sao-os-tres-pilares-da-maconaria/. Acesso em: 26 out. 2026.</w:t>
       </w:r>
     </w:p>
     <w:sectPr>

</xml_diff>

<commit_message>
Corda: remove contexto paragraph, soften exclusivity claim
Co-Authored-By: Claude Sonnet 5.5 <noreply@anthropic.com>
Claude-Session: https://claude.ai/code/session_015AGSt81GPbHH6yYpGnQKdU
</commit_message>
<xml_diff>
--- a/Inc 3/A_Corda_de_81_Nos_no_Rito_Brasileiro.docx
+++ b/Inc 3/A_Corda_de_81_Nos_no_Rito_Brasileiro.docx
@@ -71,21 +71,6 @@
           <w:b w:val="0"/>
           <w:sz w:val="24"/>
         </w:rPr>
-        <w:t>Comecemos pelo contexto. O Rito Brasileiro foi organizado no Brasil, no início do século XX, a partir do Rito Moderno, também chamado Francês, com a incorporação de elementos de outros ritos. Seu propósito foi dar à Maçonaria brasileira um ritual próprio, em português, que traduzisse a nossa realidade sem romper com a tradição universal da Ordem. É nesse espírito que a corda deve ser compreendida: um símbolo antigo, recebido da tradição, e vivido por nós à maneira brasileira.</w:t>
-      </w:r>
-    </w:p>
-    <w:p>
-      <w:pPr>
-        <w:spacing w:line="240" w:lineRule="auto" w:before="0" w:after="120"/>
-        <w:ind w:firstLine="709"/>
-        <w:jc w:val="both"/>
-      </w:pPr>
-      <w:r>
-        <w:rPr>
-          <w:rFonts w:ascii="Times New Roman" w:hAnsi="Times New Roman"/>
-          <w:b w:val="0"/>
-          <w:sz w:val="24"/>
-        </w:rPr>
         <w:t>A corda é, antes de mais nada, um instrumento do ofício. Os construtores sempre a utilizaram para traçar alinhamentos, marcar fundações e medir terrenos. Uma tradição frequentemente repetida lembra os esticadores de corda do antigo Egito, que, depois das cheias do Nilo, restabeleciam os limites dos campos, e conta que, com uma corda dividida em doze partes iguais, formavam um triângulo de lados três, quatro e cinco, obtendo assim um ângulo reto. Seja ou não exata a história, o fato é que a corda une em si duas ideias caras à Maçonaria: a medida e a retidão. Quem a estende traça um limite e, ao mesmo tempo, estabelece uma ordem.</w:t>
       </w:r>
     </w:p>
@@ -101,7 +86,7 @@
           <w:b w:val="0"/>
           <w:sz w:val="24"/>
         </w:rPr>
-        <w:t>O cordão com nós e borlas, tal como o conhecemos nas lojas, tem parentesco com os chamados laços de amor, enlaces de cordão que ornamentavam os templos na Maçonaria francesa do século XVIII. Dispostos ao redor da Loja, geralmente na parte alta das paredes, eles terminavam em borlas que desciam nos quatro cantos do Painel. É esse o desenho que vemos nos painéis de Companheiro e de Aprendiz, no qual a corda emoldura a cena e nela fecha, simbolicamente, o espaço da Loja. No Rito Brasileiro, esse cordão ganhou uma característica própria, que lhe dá nome: o número de seus nós, oitenta e um.</w:t>
+        <w:t>O cordão com nós e borlas, tal como o conhecemos nas lojas, tem parentesco com os chamados laços de amor, enlaces de cordão que ornamentavam os templos na Maçonaria francesa do século XVIII. Dispostos ao redor da Loja, geralmente na parte alta das paredes, eles terminavam em borlas que desciam nos quatro cantos do Painel. É esse o desenho que vemos nos painéis de Companheiro e de Aprendiz, no qual a corda emoldura a cena e nela fecha, simbolicamente, o espaço da Loja. Na Maçonaria brasileira, esse cordão é conhecido pelo número de seus nós: oitenta e um.</w:t>
       </w:r>
     </w:p>
     <w:p>

</xml_diff>